<commit_message>
v2: course data moves to the Rook wiki and database
Company documents, glossary, team directory, roadmap, release history,
the Slack thread, the four interview transcripts, the tickets, the
callout history CSV and the four briefs now live in Notion (rook-wiki)
and Supabase (rook-database), and are deleted here.

Priya's handover is regenerated with staff by role. dispatch-routing
uses the database's three outcomes (taken, turned down, missed) and
keys responders by name; staff by role in its comments.

Co-Authored-By: Claude Opus 5.5 <noreply@anthropic.com>
</commit_message>
<xml_diff>
--- a/00-rook/company/notes/handoff-from-priya.docx
+++ b/00-rook/company/notes/handoff-from-priya.docx
@@ -31,7 +31,7 @@
           <w:sz w:val="18"/>
           <w:szCs w:val="18"/>
         </w:rPr>
-        <w:t xml:space="preserve">Priya Raghunathan → incoming PM · written 21 August 2026</w:t>
+        <w:t xml:space="preserve">Priya → incoming PM · written 21 August 2026</w:t>
       </w:r>
     </w:p>
     <w:p>
@@ -124,7 +124,7 @@
           <w:sz w:val="22"/>
           <w:szCs w:val="22"/>
         </w:rPr>
-        <w:t xml:space="preserve">Marcus Oyelaran runs engineering for Dispatch. Straight with you, will tell you when something is a bad idea. Start here for anything you're unsure about.</w:t>
+        <w:t xml:space="preserve">Our engineering manager runs engineering for Dispatch. Straight with you, will tell you when something is a bad idea. Start here for anything you're unsure about.</w:t>
       </w:r>
     </w:p>
     <w:p>
@@ -142,7 +142,7 @@
           <w:sz w:val="22"/>
           <w:szCs w:val="22"/>
         </w:rPr>
-        <w:t xml:space="preserve">Wen Li is the staff engineer on routing. She built it. If you want to actually understand how a responder gets ranked, it's a conversation with Wen, not a document — there isn't a good document.</w:t>
+        <w:t xml:space="preserve">Our staff engineer built the part that decides who gets pinged. If you want to actually understand how a responder gets ranked, it's a conversation with her, not a document — there isn't a good document.</w:t>
       </w:r>
     </w:p>
     <w:p>
@@ -160,7 +160,7 @@
           <w:sz w:val="22"/>
           <w:szCs w:val="22"/>
         </w:rPr>
-        <w:t xml:space="preserve">Nadia Hoffmann leads support and sees the complaint volume before anyone else does. Worth a standing fifteen minutes.</w:t>
+        <w:t xml:space="preserve">Our support lead hears what handlers are unhappy about before anyone else does. Worth a standing fifteen minutes.</w:t>
       </w:r>
     </w:p>
     <w:p>
@@ -178,7 +178,7 @@
           <w:sz w:val="22"/>
           <w:szCs w:val="22"/>
         </w:rPr>
-        <w:t xml:space="preserve">Helen Achebe is your director. She's good. She'll give you room.</w:t>
+        <w:t xml:space="preserve">The Director of Product is your director. She's good. She'll give you room.</w:t>
       </w:r>
     </w:p>
     <w:p>
@@ -196,7 +196,7 @@
           <w:sz w:val="22"/>
           <w:szCs w:val="22"/>
         </w:rPr>
-        <w:t xml:space="preserve">If you need numbers, Marcus can usually pull something for you.</w:t>
+        <w:t xml:space="preserve">If you need numbers, the engineering manager can usually pull something for you.</w:t>
       </w:r>
     </w:p>
     <w:p>
@@ -241,7 +241,7 @@
           <w:sz w:val="22"/>
           <w:szCs w:val="22"/>
         </w:rPr>
-        <w:t xml:space="preserve">Acceptance is down since the release and complaint volume is up. Before someone tells you the release broke it: August is always soft for us, every year, and we also cut the ping timeout in the same release, so there are at least two things moving at once and a seasonal pattern underneath. My read is that it's mostly seasonal and it will come back in September. I'd look there first before you go pulling the change to who gets pinged apart.</w:t>
+        <w:t xml:space="preserve">Fewer pings are being taken since the release, and more handlers are writing in to complain. Before someone tells you the release broke it: August is always soft for us, every year, and we also cut the ping timeout in the same release, so there are at least two things moving at once and a seasonal pattern underneath. My read is that it's mostly seasonal and it will come back in September. I'd look there first before you go pulling the change to who gets pinged apart.</w:t>
       </w:r>
     </w:p>
     <w:p>
@@ -289,7 +289,7 @@
           <w:sz w:val="22"/>
           <w:szCs w:val="22"/>
         </w:rPr>
-        <w:t xml:space="preserve">A couple of items got squeezed out of 4.2 when the timeline compressed. Have a conversation with Helen about which of them are still Q3 commitments and which quietly aren't — that conversation hasn't happened and it needs to.</w:t>
+        <w:t xml:space="preserve">A couple of items got squeezed out of 4.2 when the timeline compressed. Have a conversation with the Director of Product about which of them are still Q3 commitments and which quietly aren't — that conversation hasn't happened and it needs to.</w:t>
       </w:r>
     </w:p>
     <w:p>

</xml_diff>